<commit_message>
Atualização Ata de Reunião
Versão 0.1.1
</commit_message>
<xml_diff>
--- a/FDM/6.Gerenciamento de Projeto/Atas/FDM - Ata de Reunião - 15-9-2026.docx
+++ b/FDM/6.Gerenciamento de Projeto/Atas/FDM - Ata de Reunião - 15-9-2026.docx
@@ -2432,7 +2432,13 @@
             <w:t xml:space="preserve">Versão </w:t>
           </w:r>
           <w:r>
-            <w:t>0.0.1</w:t>
+            <w:t>0.</w:t>
+          </w:r>
+          <w:r>
+            <w:t>1</w:t>
+          </w:r>
+          <w:r>
+            <w:t>.1</w:t>
           </w:r>
         </w:p>
       </w:tc>
@@ -3654,6 +3660,48 @@
       </w:tblCellMar>
     </w:tblPr>
   </w:style>
+  <w:style w:type="paragraph" w:styleId="Cabealho">
+    <w:name w:val="header"/>
+    <w:basedOn w:val="Normal"/>
+    <w:link w:val="CabealhoChar"/>
+    <w:uiPriority w:val="99"/>
+    <w:unhideWhenUsed/>
+    <w:rsid w:val="00E13B90"/>
+    <w:pPr>
+      <w:tabs>
+        <w:tab w:val="center" w:pos="4252"/>
+        <w:tab w:val="right" w:pos="8504"/>
+      </w:tabs>
+    </w:pPr>
+  </w:style>
+  <w:style w:type="character" w:customStyle="1" w:styleId="CabealhoChar">
+    <w:name w:val="Cabeçalho Char"/>
+    <w:basedOn w:val="Fontepargpadro"/>
+    <w:link w:val="Cabealho"/>
+    <w:uiPriority w:val="99"/>
+    <w:rsid w:val="00E13B90"/>
+  </w:style>
+  <w:style w:type="paragraph" w:styleId="Rodap">
+    <w:name w:val="footer"/>
+    <w:basedOn w:val="Normal"/>
+    <w:link w:val="RodapChar"/>
+    <w:uiPriority w:val="99"/>
+    <w:unhideWhenUsed/>
+    <w:rsid w:val="00E13B90"/>
+    <w:pPr>
+      <w:tabs>
+        <w:tab w:val="center" w:pos="4252"/>
+        <w:tab w:val="right" w:pos="8504"/>
+      </w:tabs>
+    </w:pPr>
+  </w:style>
+  <w:style w:type="character" w:customStyle="1" w:styleId="RodapChar">
+    <w:name w:val="Rodapé Char"/>
+    <w:basedOn w:val="Fontepargpadro"/>
+    <w:link w:val="Rodap"/>
+    <w:uiPriority w:val="99"/>
+    <w:rsid w:val="00E13B90"/>
+  </w:style>
 </w:styles>
 </file>
 

</xml_diff>